<commit_message>
Add ultra-detailed step-by-step Data Flow Work Procedures to AI_Interview_Prep_Chatbot_Documentation.docx
</commit_message>
<xml_diff>
--- a/AI_Interview_Prep_Chatbot_Documentation.docx
+++ b/AI_Interview_Prep_Chatbot_Documentation.docx
@@ -318,7 +318,22 @@
           <w:color w:val="059669"/>
           <w:sz w:val="28"/>
         </w:rPr>
-        <w:t>Core Data Flow Workflows</w:t>
+        <w:t>Detailed Data Flow &amp; Step-by-Step Work Procedures</w:t>
+      </w:r>
+    </w:p>
+    <w:p>
+      <w:pPr>
+        <w:keepNext/>
+        <w:spacing w:before="240" w:after="120"/>
+      </w:pPr>
+      <w:r>
+        <w:rPr>
+          <w:rFonts w:ascii="Calibri" w:hAnsi="Calibri"/>
+          <w:b/>
+          <w:color w:val="059669"/>
+          <w:sz w:val="28"/>
+        </w:rPr>
+        <w:t>1. User Authentication &amp; Authorization Work Procedure</w:t>
       </w:r>
     </w:p>
     <w:p>
@@ -333,7 +348,7 @@
           <w:color w:val="1E1B4B"/>
           <w:sz w:val="22"/>
         </w:rPr>
-        <w:t xml:space="preserve">1. Authentication Flow: </w:t>
+        <w:t xml:space="preserve">• Step 1 (Input &amp; Validation): </w:t>
       </w:r>
       <w:r>
         <w:rPr>
@@ -342,7 +357,7 @@
           <w:color w:val="1E293B"/>
           <w:sz w:val="22"/>
         </w:rPr>
-        <w:t>User submits credentials via Login or Register screen ('Rakib Hossen' default placeholder). The backend hashes passwords with Bcrypt, issues a JWT token with 24-hour validity, and stores it in AsyncStorage on the mobile device.</w:t>
+        <w:t>User inputs credentials on Mobile Login or Register screen ('Rakib Hossen' default placeholder). Frontend performs client-side email format and password length checks.</w:t>
       </w:r>
     </w:p>
     <w:p>
@@ -357,7 +372,7 @@
           <w:color w:val="1E1B4B"/>
           <w:sz w:val="22"/>
         </w:rPr>
-        <w:t xml:space="preserve">2. Mock Interview Startup &amp; Scoring Flow: </w:t>
+        <w:t xml:space="preserve">• Step 2 (API Request): </w:t>
       </w:r>
       <w:r>
         <w:rPr>
@@ -366,7 +381,7 @@
           <w:color w:val="1E293B"/>
           <w:sz w:val="22"/>
         </w:rPr>
-        <w:t>User selects a topic (e.g. OOP). Client calls /api/chat/start. Backend validates Freemium plan access, creates a session in DB, fetches questions, and returns the first question. When user submits an answer to /api/chat/message, the AI engine evaluates technical correctness, assigns a strict 0-10 score (0 for gibberish/invalid/incorrect answers, 1-6 for partial, 7-10 for technical depth), saves the scored message in DB, and returns next question.</w:t>
+        <w:t>Client sends HTTP POST request to /api/auth/register or /api/auth/login with JSON payload.</w:t>
       </w:r>
     </w:p>
     <w:p>
@@ -381,7 +396,7 @@
           <w:color w:val="1E1B4B"/>
           <w:sz w:val="22"/>
         </w:rPr>
-        <w:t xml:space="preserve">3. Ask AI Free-Form Chat Flow: </w:t>
+        <w:t xml:space="preserve">• Step 3 (Bcrypt Hashing &amp; Database Verification): </w:t>
       </w:r>
       <w:r>
         <w:rPr>
@@ -390,7 +405,7 @@
           <w:color w:val="1E293B"/>
           <w:sz w:val="22"/>
         </w:rPr>
-        <w:t>User accesses Ask AI tab. App fetches active AI provider (/api/ask-ai/status). User sends free-form messages. Backend maintains 20-message chat history memory, auto-generates conversation titles, and persists messages in ask_ai_conversations and ask_ai_messages tables.</w:t>
+        <w:t>FastAPI hashes password using PassLib Bcrypt. On login, backend queries users DB table and verifies hashed password.</w:t>
       </w:r>
     </w:p>
     <w:p>
@@ -405,7 +420,7 @@
           <w:color w:val="1E1B4B"/>
           <w:sz w:val="22"/>
         </w:rPr>
-        <w:t xml:space="preserve">4. Session Completion &amp; Analytics Flow: </w:t>
+        <w:t xml:space="preserve">• Step 4 (JWT Token Generation): </w:t>
       </w:r>
       <w:r>
         <w:rPr>
@@ -414,7 +429,523 @@
           <w:color w:val="1E293B"/>
           <w:sz w:val="22"/>
         </w:rPr>
-        <w:t>When user ends a session (/api/chat/end), backend calculates total questions, average numerical score (e.g. 8.5/10), generates an overall qualitative summary, and returns interactive result stats.</w:t>
+        <w:t>Backend generates a JSON Web Token (JWT) signed with a secret key, encoding user ID, email, and 24-hour expiration time.</w:t>
+      </w:r>
+    </w:p>
+    <w:p>
+      <w:pPr>
+        <w:pStyle w:val="ListBullet"/>
+        <w:spacing w:before="0" w:after="80" w:line="276" w:lineRule="auto"/>
+      </w:pPr>
+      <w:r>
+        <w:rPr>
+          <w:rFonts w:ascii="Calibri" w:hAnsi="Calibri"/>
+          <w:b/>
+          <w:color w:val="1E1B4B"/>
+          <w:sz w:val="22"/>
+        </w:rPr>
+        <w:t xml:space="preserve">• Step 5 (Client Storage &amp; Axios Interceptor): </w:t>
+      </w:r>
+      <w:r>
+        <w:rPr>
+          <w:rFonts w:ascii="Calibri" w:hAnsi="Calibri"/>
+          <w:b w:val="0"/>
+          <w:color w:val="1E293B"/>
+          <w:sz w:val="22"/>
+        </w:rPr>
+        <w:t>Mobile app stores JWT in @react-native-async-storage/async-storage. An Axios request interceptor automatically attaches 'Authorization: Bearer &lt;token&gt;' to all subsequent HTTP API headers.</w:t>
+      </w:r>
+    </w:p>
+    <w:p>
+      <w:pPr>
+        <w:keepNext/>
+        <w:spacing w:before="240" w:after="120"/>
+      </w:pPr>
+      <w:r>
+        <w:rPr>
+          <w:rFonts w:ascii="Calibri" w:hAnsi="Calibri"/>
+          <w:b/>
+          <w:color w:val="059669"/>
+          <w:sz w:val="28"/>
+        </w:rPr>
+        <w:t>2. Mock Interview Startup &amp; Question Retrieval Work Procedure</w:t>
+      </w:r>
+    </w:p>
+    <w:p>
+      <w:pPr>
+        <w:pStyle w:val="ListBullet"/>
+        <w:spacing w:before="0" w:after="80" w:line="276" w:lineRule="auto"/>
+      </w:pPr>
+      <w:r>
+        <w:rPr>
+          <w:rFonts w:ascii="Calibri" w:hAnsi="Calibri"/>
+          <w:b/>
+          <w:color w:val="1E1B4B"/>
+          <w:sz w:val="22"/>
+        </w:rPr>
+        <w:t xml:space="preserve">• Step 1 (Topic Selection): </w:t>
+      </w:r>
+      <w:r>
+        <w:rPr>
+          <w:rFonts w:ascii="Calibri" w:hAnsi="Calibri"/>
+          <w:b w:val="0"/>
+          <w:color w:val="1E293B"/>
+          <w:sz w:val="22"/>
+        </w:rPr>
+        <w:t>User taps a topic (e.g. OOP) on TopicsScreen.</w:t>
+      </w:r>
+    </w:p>
+    <w:p>
+      <w:pPr>
+        <w:pStyle w:val="ListBullet"/>
+        <w:spacing w:before="0" w:after="80" w:line="276" w:lineRule="auto"/>
+      </w:pPr>
+      <w:r>
+        <w:rPr>
+          <w:rFonts w:ascii="Calibri" w:hAnsi="Calibri"/>
+          <w:b/>
+          <w:color w:val="1E1B4B"/>
+          <w:sz w:val="22"/>
+        </w:rPr>
+        <w:t xml:space="preserve">• Step 2 (Access Control Check): </w:t>
+      </w:r>
+      <w:r>
+        <w:rPr>
+          <w:rFonts w:ascii="Calibri" w:hAnsi="Calibri"/>
+          <w:b w:val="0"/>
+          <w:color w:val="1E293B"/>
+          <w:sz w:val="22"/>
+        </w:rPr>
+        <w:t>Client sends HTTP POST to /api/chat/start. Backend validates JWT token and checks if user plan ('free' vs 'pro') permits access to requested topic.</w:t>
+      </w:r>
+    </w:p>
+    <w:p>
+      <w:pPr>
+        <w:pStyle w:val="ListBullet"/>
+        <w:spacing w:before="0" w:after="80" w:line="276" w:lineRule="auto"/>
+      </w:pPr>
+      <w:r>
+        <w:rPr>
+          <w:rFonts w:ascii="Calibri" w:hAnsi="Calibri"/>
+          <w:b/>
+          <w:color w:val="1E1B4B"/>
+          <w:sz w:val="22"/>
+        </w:rPr>
+        <w:t xml:space="preserve">• Step 3 (Session Initialization): </w:t>
+      </w:r>
+      <w:r>
+        <w:rPr>
+          <w:rFonts w:ascii="Calibri" w:hAnsi="Calibri"/>
+          <w:b w:val="0"/>
+          <w:color w:val="1E293B"/>
+          <w:sz w:val="22"/>
+        </w:rPr>
+        <w:t>Backend queries questions table for the topic, randomly selects initial question, creates a record in sessions table, and inserts bot message into messages table.</w:t>
+      </w:r>
+    </w:p>
+    <w:p>
+      <w:pPr>
+        <w:pStyle w:val="ListBullet"/>
+        <w:spacing w:before="0" w:after="80" w:line="276" w:lineRule="auto"/>
+      </w:pPr>
+      <w:r>
+        <w:rPr>
+          <w:rFonts w:ascii="Calibri" w:hAnsi="Calibri"/>
+          <w:b/>
+          <w:color w:val="1E1B4B"/>
+          <w:sz w:val="22"/>
+        </w:rPr>
+        <w:t xml:space="preserve">• Step 4 (UI Render): </w:t>
+      </w:r>
+      <w:r>
+        <w:rPr>
+          <w:rFonts w:ascii="Calibri" w:hAnsi="Calibri"/>
+          <w:b w:val="0"/>
+          <w:color w:val="1E293B"/>
+          <w:sz w:val="22"/>
+        </w:rPr>
+        <w:t>Backend returns session_id and initial question text. Mobile app navigates to ChatScreen and renders initial interviewer message.</w:t>
+      </w:r>
+    </w:p>
+    <w:p>
+      <w:pPr>
+        <w:keepNext/>
+        <w:spacing w:before="240" w:after="120"/>
+      </w:pPr>
+      <w:r>
+        <w:rPr>
+          <w:rFonts w:ascii="Calibri" w:hAnsi="Calibri"/>
+          <w:b/>
+          <w:color w:val="059669"/>
+          <w:sz w:val="28"/>
+        </w:rPr>
+        <w:t>3. Answer Submission &amp; Dual AI Evaluation Work Procedure</w:t>
+      </w:r>
+    </w:p>
+    <w:p>
+      <w:pPr>
+        <w:pStyle w:val="ListBullet"/>
+        <w:spacing w:before="0" w:after="80" w:line="276" w:lineRule="auto"/>
+      </w:pPr>
+      <w:r>
+        <w:rPr>
+          <w:rFonts w:ascii="Calibri" w:hAnsi="Calibri"/>
+          <w:b/>
+          <w:color w:val="1E1B4B"/>
+          <w:sz w:val="22"/>
+        </w:rPr>
+        <w:t xml:space="preserve">• Step 1 (User Submission): </w:t>
+      </w:r>
+      <w:r>
+        <w:rPr>
+          <w:rFonts w:ascii="Calibri" w:hAnsi="Calibri"/>
+          <w:b w:val="0"/>
+          <w:color w:val="1E293B"/>
+          <w:sz w:val="22"/>
+        </w:rPr>
+        <w:t>User types technical response on ChatScreen and taps Send. App sends HTTP POST to /api/chat/message with session_id and answer content.</w:t>
+      </w:r>
+    </w:p>
+    <w:p>
+      <w:pPr>
+        <w:pStyle w:val="ListBullet"/>
+        <w:spacing w:before="0" w:after="80" w:line="276" w:lineRule="auto"/>
+      </w:pPr>
+      <w:r>
+        <w:rPr>
+          <w:rFonts w:ascii="Calibri" w:hAnsi="Calibri"/>
+          <w:b/>
+          <w:color w:val="1E1B4B"/>
+          <w:sz w:val="22"/>
+        </w:rPr>
+        <w:t xml:space="preserve">• Step 2 (Message Persistence): </w:t>
+      </w:r>
+      <w:r>
+        <w:rPr>
+          <w:rFonts w:ascii="Calibri" w:hAnsi="Calibri"/>
+          <w:b w:val="0"/>
+          <w:color w:val="1E293B"/>
+          <w:sz w:val="22"/>
+        </w:rPr>
+        <w:t>FastAPI saves user answer into messages table.</w:t>
+      </w:r>
+    </w:p>
+    <w:p>
+      <w:pPr>
+        <w:pStyle w:val="ListBullet"/>
+        <w:spacing w:before="0" w:after="80" w:line="276" w:lineRule="auto"/>
+      </w:pPr>
+      <w:r>
+        <w:rPr>
+          <w:rFonts w:ascii="Calibri" w:hAnsi="Calibri"/>
+          <w:b/>
+          <w:color w:val="1E1B4B"/>
+          <w:sz w:val="22"/>
+        </w:rPr>
+        <w:t xml:space="preserve">• Step 3 (Gibberish &amp; Heuristic Check): </w:t>
+      </w:r>
+      <w:r>
+        <w:rPr>
+          <w:rFonts w:ascii="Calibri" w:hAnsi="Calibri"/>
+          <w:b w:val="0"/>
+          <w:color w:val="1E293B"/>
+          <w:sz w:val="22"/>
+        </w:rPr>
+        <w:t>Backend passes text through is_gibberish and is_dont_know_or_invalid filters. Keyboard mashing ('hsjsja') or skip responses receive instant Score: 0/10 with corrective feedback.</w:t>
+      </w:r>
+    </w:p>
+    <w:p>
+      <w:pPr>
+        <w:pStyle w:val="ListBullet"/>
+        <w:spacing w:before="0" w:after="80" w:line="276" w:lineRule="auto"/>
+      </w:pPr>
+      <w:r>
+        <w:rPr>
+          <w:rFonts w:ascii="Calibri" w:hAnsi="Calibri"/>
+          <w:b/>
+          <w:color w:val="1E1B4B"/>
+          <w:sz w:val="22"/>
+        </w:rPr>
+        <w:t xml:space="preserve">• Step 4 (AI / Keyword Evaluation): </w:t>
+      </w:r>
+      <w:r>
+        <w:rPr>
+          <w:rFonts w:ascii="Calibri" w:hAnsi="Calibri"/>
+          <w:b w:val="0"/>
+          <w:color w:val="1E293B"/>
+          <w:sz w:val="22"/>
+        </w:rPr>
+        <w:t>For technical answers, backend invokes the AI Provider Cascade (Gemini 3.6 Flash / Ollama / Keyword Engine). The AI rates technical accuracy, assigns integer score (0-10), and generates 2-3 sentences of feedback.</w:t>
+      </w:r>
+    </w:p>
+    <w:p>
+      <w:pPr>
+        <w:pStyle w:val="ListBullet"/>
+        <w:spacing w:before="0" w:after="80" w:line="276" w:lineRule="auto"/>
+      </w:pPr>
+      <w:r>
+        <w:rPr>
+          <w:rFonts w:ascii="Calibri" w:hAnsi="Calibri"/>
+          <w:b/>
+          <w:color w:val="1E1B4B"/>
+          <w:sz w:val="22"/>
+        </w:rPr>
+        <w:t xml:space="preserve">• Step 5 (Next Question Bank Selection): </w:t>
+      </w:r>
+      <w:r>
+        <w:rPr>
+          <w:rFonts w:ascii="Calibri" w:hAnsi="Calibri"/>
+          <w:b w:val="0"/>
+          <w:color w:val="1E293B"/>
+          <w:sz w:val="22"/>
+        </w:rPr>
+        <w:t>Backend fetches unasked questions for topic from database, inserts bot message with score into DB, and returns reply, score, and next_question.</w:t>
+      </w:r>
+    </w:p>
+    <w:p>
+      <w:pPr>
+        <w:pStyle w:val="ListBullet"/>
+        <w:spacing w:before="0" w:after="80" w:line="276" w:lineRule="auto"/>
+      </w:pPr>
+      <w:r>
+        <w:rPr>
+          <w:rFonts w:ascii="Calibri" w:hAnsi="Calibri"/>
+          <w:b/>
+          <w:color w:val="1E1B4B"/>
+          <w:sz w:val="22"/>
+        </w:rPr>
+        <w:t xml:space="preserve">• Step 6 (Real-Time Badge Render): </w:t>
+      </w:r>
+      <w:r>
+        <w:rPr>
+          <w:rFonts w:ascii="Calibri" w:hAnsi="Calibri"/>
+          <w:b w:val="0"/>
+          <w:color w:val="1E293B"/>
+          <w:sz w:val="22"/>
+        </w:rPr>
+        <w:t>Mobile app receives response, appends message to list, and displays star badge (⭐ Score: X/10) on user feedback bubble.</w:t>
+      </w:r>
+    </w:p>
+    <w:p>
+      <w:pPr>
+        <w:keepNext/>
+        <w:spacing w:before="240" w:after="120"/>
+      </w:pPr>
+      <w:r>
+        <w:rPr>
+          <w:rFonts w:ascii="Calibri" w:hAnsi="Calibri"/>
+          <w:b/>
+          <w:color w:val="059669"/>
+          <w:sz w:val="28"/>
+        </w:rPr>
+        <w:t>4. Ask AI Free-Form Chat Work Procedure</w:t>
+      </w:r>
+    </w:p>
+    <w:p>
+      <w:pPr>
+        <w:pStyle w:val="ListBullet"/>
+        <w:spacing w:before="0" w:after="80" w:line="276" w:lineRule="auto"/>
+      </w:pPr>
+      <w:r>
+        <w:rPr>
+          <w:rFonts w:ascii="Calibri" w:hAnsi="Calibri"/>
+          <w:b/>
+          <w:color w:val="1E1B4B"/>
+          <w:sz w:val="22"/>
+        </w:rPr>
+        <w:t xml:space="preserve">• Step 1 (Status Verification): </w:t>
+      </w:r>
+      <w:r>
+        <w:rPr>
+          <w:rFonts w:ascii="Calibri" w:hAnsi="Calibri"/>
+          <w:b w:val="0"/>
+          <w:color w:val="1E293B"/>
+          <w:sz w:val="22"/>
+        </w:rPr>
+        <w:t>When AskAIScreen loads, client requests /api/ask-ai/status. Backend returns active AI provider (✨ Gemini, 💻 Ollama, or 🌐 Cloud AI).</w:t>
+      </w:r>
+    </w:p>
+    <w:p>
+      <w:pPr>
+        <w:pStyle w:val="ListBullet"/>
+        <w:spacing w:before="0" w:after="80" w:line="276" w:lineRule="auto"/>
+      </w:pPr>
+      <w:r>
+        <w:rPr>
+          <w:rFonts w:ascii="Calibri" w:hAnsi="Calibri"/>
+          <w:b/>
+          <w:color w:val="1E1B4B"/>
+          <w:sz w:val="22"/>
+        </w:rPr>
+        <w:t xml:space="preserve">• Step 2 (Conversation History Loading): </w:t>
+      </w:r>
+      <w:r>
+        <w:rPr>
+          <w:rFonts w:ascii="Calibri" w:hAnsi="Calibri"/>
+          <w:b w:val="0"/>
+          <w:color w:val="1E293B"/>
+          <w:sz w:val="22"/>
+        </w:rPr>
+        <w:t>App calls /api/ask-ai/conversations to load user's previous chat threads into the drawer sidebar.</w:t>
+      </w:r>
+    </w:p>
+    <w:p>
+      <w:pPr>
+        <w:pStyle w:val="ListBullet"/>
+        <w:spacing w:before="0" w:after="80" w:line="276" w:lineRule="auto"/>
+      </w:pPr>
+      <w:r>
+        <w:rPr>
+          <w:rFonts w:ascii="Calibri" w:hAnsi="Calibri"/>
+          <w:b/>
+          <w:color w:val="1E1B4B"/>
+          <w:sz w:val="22"/>
+        </w:rPr>
+        <w:t xml:space="preserve">• Step 3 (Prompt Submission &amp; History Context): </w:t>
+      </w:r>
+      <w:r>
+        <w:rPr>
+          <w:rFonts w:ascii="Calibri" w:hAnsi="Calibri"/>
+          <w:b w:val="0"/>
+          <w:color w:val="1E293B"/>
+          <w:sz w:val="22"/>
+        </w:rPr>
+        <w:t>User submits prompt to /api/ask-ai/ask. Backend fetches up to 20 recent messages from ask_ai_messages table to build multi-turn chat memory.</w:t>
+      </w:r>
+    </w:p>
+    <w:p>
+      <w:pPr>
+        <w:pStyle w:val="ListBullet"/>
+        <w:spacing w:before="0" w:after="80" w:line="276" w:lineRule="auto"/>
+      </w:pPr>
+      <w:r>
+        <w:rPr>
+          <w:rFonts w:ascii="Calibri" w:hAnsi="Calibri"/>
+          <w:b/>
+          <w:color w:val="1E1B4B"/>
+          <w:sz w:val="22"/>
+        </w:rPr>
+        <w:t xml:space="preserve">• Step 4 (AI Execution &amp; Persistence): </w:t>
+      </w:r>
+      <w:r>
+        <w:rPr>
+          <w:rFonts w:ascii="Calibri" w:hAnsi="Calibri"/>
+          <w:b w:val="0"/>
+          <w:color w:val="1E293B"/>
+          <w:sz w:val="22"/>
+        </w:rPr>
+        <w:t>Backend calls active AI model, receives response, persists both user and assistant messages in ask_ai_messages, auto-generates conversation title if new, and returns reply.</w:t>
+      </w:r>
+    </w:p>
+    <w:p>
+      <w:pPr>
+        <w:pStyle w:val="ListBullet"/>
+        <w:spacing w:before="0" w:after="80" w:line="276" w:lineRule="auto"/>
+      </w:pPr>
+      <w:r>
+        <w:rPr>
+          <w:rFonts w:ascii="Calibri" w:hAnsi="Calibri"/>
+          <w:b/>
+          <w:color w:val="1E1B4B"/>
+          <w:sz w:val="22"/>
+        </w:rPr>
+        <w:t xml:space="preserve">• Step 5 (Markdown UI Render): </w:t>
+      </w:r>
+      <w:r>
+        <w:rPr>
+          <w:rFonts w:ascii="Calibri" w:hAnsi="Calibri"/>
+          <w:b w:val="0"/>
+          <w:color w:val="1E293B"/>
+          <w:sz w:val="22"/>
+        </w:rPr>
+        <w:t>Mobile app renders response formatted with code blocks, bullet points, and copy functionality.</w:t>
+      </w:r>
+    </w:p>
+    <w:p>
+      <w:pPr>
+        <w:keepNext/>
+        <w:spacing w:before="240" w:after="120"/>
+      </w:pPr>
+      <w:r>
+        <w:rPr>
+          <w:rFonts w:ascii="Calibri" w:hAnsi="Calibri"/>
+          <w:b/>
+          <w:color w:val="059669"/>
+          <w:sz w:val="28"/>
+        </w:rPr>
+        <w:t>5. Session Completion &amp; Analytics Work Procedure</w:t>
+      </w:r>
+    </w:p>
+    <w:p>
+      <w:pPr>
+        <w:pStyle w:val="ListBullet"/>
+        <w:spacing w:before="0" w:after="80" w:line="276" w:lineRule="auto"/>
+      </w:pPr>
+      <w:r>
+        <w:rPr>
+          <w:rFonts w:ascii="Calibri" w:hAnsi="Calibri"/>
+          <w:b/>
+          <w:color w:val="1E1B4B"/>
+          <w:sz w:val="22"/>
+        </w:rPr>
+        <w:t xml:space="preserve">• Step 1 (End Session Request): </w:t>
+      </w:r>
+      <w:r>
+        <w:rPr>
+          <w:rFonts w:ascii="Calibri" w:hAnsi="Calibri"/>
+          <w:b w:val="0"/>
+          <w:color w:val="1E293B"/>
+          <w:sz w:val="22"/>
+        </w:rPr>
+        <w:t>User taps 'End Session' button. App posts to /api/chat/end with session_id.</w:t>
+      </w:r>
+    </w:p>
+    <w:p>
+      <w:pPr>
+        <w:pStyle w:val="ListBullet"/>
+        <w:spacing w:before="0" w:after="80" w:line="276" w:lineRule="auto"/>
+      </w:pPr>
+      <w:r>
+        <w:rPr>
+          <w:rFonts w:ascii="Calibri" w:hAnsi="Calibri"/>
+          <w:b/>
+          <w:color w:val="1E1B4B"/>
+          <w:sz w:val="22"/>
+        </w:rPr>
+        <w:t xml:space="preserve">• Step 2 (Score Aggregation): </w:t>
+      </w:r>
+      <w:r>
+        <w:rPr>
+          <w:rFonts w:ascii="Calibri" w:hAnsi="Calibri"/>
+          <w:b w:val="0"/>
+          <w:color w:val="1E293B"/>
+          <w:sz w:val="22"/>
+        </w:rPr>
+        <w:t>Backend queries all scored messages for session, calculates arithmetic mean score (e.g. 8.5/10), and assigns qualitative performance tier.</w:t>
+      </w:r>
+    </w:p>
+    <w:p>
+      <w:pPr>
+        <w:pStyle w:val="ListBullet"/>
+        <w:spacing w:before="0" w:after="80" w:line="276" w:lineRule="auto"/>
+      </w:pPr>
+      <w:r>
+        <w:rPr>
+          <w:rFonts w:ascii="Calibri" w:hAnsi="Calibri"/>
+          <w:b/>
+          <w:color w:val="1E1B4B"/>
+          <w:sz w:val="22"/>
+        </w:rPr>
+        <w:t xml:space="preserve">• Step 3 (Summary Modal Display): </w:t>
+      </w:r>
+      <w:r>
+        <w:rPr>
+          <w:rFonts w:ascii="Calibri" w:hAnsi="Calibri"/>
+          <w:b w:val="0"/>
+          <w:color w:val="1E293B"/>
+          <w:sz w:val="22"/>
+        </w:rPr>
+        <w:t>Backend returns summary stats. Mobile app presents interactive React Native Modal showing total questions, average score, performance tier badge, and options to review history or start new topic.</w:t>
       </w:r>
     </w:p>
     <w:p>

</xml_diff>